<commit_message>
actualizacion de colores y seguridad
</commit_message>
<xml_diff>
--- a/Documentacion_Servidor.docx
+++ b/Documentacion_Servidor.docx
@@ -167,10 +167,7 @@
         <w:t>Otras librerías:</w:t>
       </w:r>
       <w:r>
-        <w:t xml:space="preserve"> psycopg2-binary, passlib, </w:t>
-      </w:r>
-      <w:r>
-        <w:t>bcrypt, jinja2, pandas, openpyxl, python-jose, python-multipart</w:t>
+        <w:t xml:space="preserve"> psycopg2-binary, passlib, bcrypt, jinja2, pandas, openpyxl, python-jose, python-multipart</w:t>
       </w:r>
     </w:p>
     <w:p>
@@ -258,13 +255,7 @@
         <w:rPr>
           <w:lang w:val="es-ES"/>
         </w:rPr>
-        <w:t>/var/www/intranet_prod/templat</w:t>
-      </w:r>
-      <w:r>
-        <w:rPr>
-          <w:lang w:val="es-ES"/>
-        </w:rPr>
-        <w:t>es</w:t>
+        <w:t>/var/www/intranet_prod/templates</w:t>
       </w:r>
       <w:r>
         <w:rPr>
@@ -362,6 +353,8 @@
         </w:rPr>
         <w:t>3. Configuración de Bases de Datos</w:t>
       </w:r>
+      <w:bookmarkStart w:id="0" w:name="_GoBack"/>
+      <w:bookmarkEnd w:id="0"/>
     </w:p>
     <w:tbl>
       <w:tblPr>
@@ -446,10 +439,7 @@
           </w:tcPr>
           <w:p>
             <w:r>
-              <w:t xml:space="preserve">Contraseña </w:t>
-            </w:r>
-            <w:r>
-              <w:t>DB</w:t>
+              <w:t>Contraseña DB</w:t>
             </w:r>
           </w:p>
         </w:tc>
@@ -734,13 +724,7 @@
         <w:rPr>
           <w:lang w:val="es-ES"/>
         </w:rPr>
-        <w:t>Los servicios están configurados para auto-inicio y manej</w:t>
-      </w:r>
-      <w:r>
-        <w:rPr>
-          <w:lang w:val="es-ES"/>
-        </w:rPr>
-        <w:t>o de procesos en background:</w:t>
+        <w:t>Los servicios están configurados para auto-inicio y manejo de procesos en background:</w:t>
       </w:r>
     </w:p>
     <w:p>
@@ -796,11 +780,21 @@
       <w:pPr>
         <w:pStyle w:val="Cita"/>
       </w:pPr>
+      <w:proofErr w:type="spellStart"/>
       <w:r>
-        <w:t>systemctl start|stop|restar</w:t>
+        <w:t>systemctl</w:t>
       </w:r>
+      <w:proofErr w:type="spellEnd"/>
       <w:r>
-        <w:t xml:space="preserve">t </w:t>
+        <w:t xml:space="preserve"> </w:t>
+      </w:r>
+      <w:proofErr w:type="spellStart"/>
+      <w:r>
+        <w:t>start|stop|restart</w:t>
+      </w:r>
+      <w:proofErr w:type="spellEnd"/>
+      <w:r>
+        <w:t xml:space="preserve"> </w:t>
       </w:r>
       <w:proofErr w:type="spellStart"/>
       <w:r>
@@ -817,8 +811,389 @@
       <w:r>
         <w:br w:type="page"/>
       </w:r>
-      <w:bookmarkStart w:id="0" w:name="_GoBack"/>
-      <w:bookmarkEnd w:id="0"/>
+    </w:p>
+    <w:p>
+      <w:pPr>
+        <w:rPr>
+          <w:rStyle w:val="TtuloCar"/>
+          <w:lang w:val="es-ES"/>
+        </w:rPr>
+      </w:pPr>
+      <w:r>
+        <w:rPr>
+          <w:lang w:val="es-ES"/>
+        </w:rPr>
+        <w:lastRenderedPageBreak/>
+        <w:t xml:space="preserve"> </w:t>
+      </w:r>
+      <w:r>
+        <w:rPr>
+          <w:rStyle w:val="TtuloCar"/>
+          <w:lang w:val="es-ES"/>
+        </w:rPr>
+        <w:t>¿Qué se está guardando actualmente en la base de datos?</w:t>
+      </w:r>
+    </w:p>
+    <w:p>
+      <w:pPr>
+        <w:rPr>
+          <w:lang w:val="es-ES"/>
+        </w:rPr>
+      </w:pPr>
+      <w:r>
+        <w:rPr>
+          <w:lang w:val="es-ES"/>
+        </w:rPr>
+        <w:t>Revisé tu archivo de modelos (models.py) y la base de datos SQLite (</w:t>
+      </w:r>
+      <w:proofErr w:type="spellStart"/>
+      <w:r>
+        <w:rPr>
+          <w:lang w:val="es-ES"/>
+        </w:rPr>
+        <w:t>intranet_local.db</w:t>
+      </w:r>
+      <w:proofErr w:type="spellEnd"/>
+      <w:r>
+        <w:rPr>
+          <w:lang w:val="es-ES"/>
+        </w:rPr>
+        <w:t>). Actualmente, tu sistema está diseñado para almacenar la siguiente información organizada en estas tablas:</w:t>
+      </w:r>
+    </w:p>
+    <w:p>
+      <w:pPr>
+        <w:numPr>
+          <w:ilvl w:val="0"/>
+          <w:numId w:val="10"/>
+        </w:numPr>
+        <w:rPr>
+          <w:lang w:val="es-ES"/>
+        </w:rPr>
+      </w:pPr>
+      <w:proofErr w:type="spellStart"/>
+      <w:r>
+        <w:rPr>
+          <w:b/>
+          <w:bCs/>
+          <w:lang w:val="es-ES"/>
+        </w:rPr>
+        <w:t>users</w:t>
+      </w:r>
+      <w:proofErr w:type="spellEnd"/>
+      <w:r>
+        <w:rPr>
+          <w:b/>
+          <w:bCs/>
+          <w:lang w:val="es-ES"/>
+        </w:rPr>
+        <w:t> (Usuarios):</w:t>
+      </w:r>
+      <w:r>
+        <w:rPr>
+          <w:lang w:val="es-ES"/>
+        </w:rPr>
+        <w:t xml:space="preserve"> Almacena los datos de inicio de sesión (correo, contraseña encriptada, nombre completo, rol - como </w:t>
+      </w:r>
+      <w:proofErr w:type="spellStart"/>
+      <w:r>
+        <w:rPr>
+          <w:lang w:val="es-ES"/>
+        </w:rPr>
+        <w:t>admin</w:t>
+      </w:r>
+      <w:proofErr w:type="spellEnd"/>
+      <w:r>
+        <w:rPr>
+          <w:lang w:val="es-ES"/>
+        </w:rPr>
+        <w:t>/</w:t>
+      </w:r>
+      <w:proofErr w:type="spellStart"/>
+      <w:r>
+        <w:rPr>
+          <w:lang w:val="es-ES"/>
+        </w:rPr>
+        <w:t>rrhh</w:t>
+      </w:r>
+      <w:proofErr w:type="spellEnd"/>
+      <w:r>
+        <w:rPr>
+          <w:lang w:val="es-ES"/>
+        </w:rPr>
+        <w:t xml:space="preserve"> o usuario común -, enlace al avatar y si están activos).</w:t>
+      </w:r>
+    </w:p>
+    <w:p>
+      <w:pPr>
+        <w:numPr>
+          <w:ilvl w:val="0"/>
+          <w:numId w:val="10"/>
+        </w:numPr>
+        <w:rPr>
+          <w:lang w:val="es-ES"/>
+        </w:rPr>
+      </w:pPr>
+      <w:proofErr w:type="spellStart"/>
+      <w:r>
+        <w:rPr>
+          <w:b/>
+          <w:bCs/>
+          <w:lang w:val="es-ES"/>
+        </w:rPr>
+        <w:t>announcements</w:t>
+      </w:r>
+      <w:proofErr w:type="spellEnd"/>
+      <w:r>
+        <w:rPr>
+          <w:b/>
+          <w:bCs/>
+          <w:lang w:val="es-ES"/>
+        </w:rPr>
+        <w:t> (Anuncios/Noticias):</w:t>
+      </w:r>
+      <w:r>
+        <w:rPr>
+          <w:lang w:val="es-ES"/>
+        </w:rPr>
+        <w:t> Aquí se guarda el título de los anuncios principales (como el del Hero banner), la URL de la imagen de fondo, un enlace opcional, si está activo y la fecha de la última actualización. </w:t>
+      </w:r>
+      <w:r>
+        <w:rPr>
+          <w:i/>
+          <w:iCs/>
+          <w:lang w:val="es-ES"/>
+        </w:rPr>
+        <w:t xml:space="preserve">(Esta será la tabla clave para los nuevos </w:t>
+      </w:r>
+      <w:proofErr w:type="spellStart"/>
+      <w:r>
+        <w:rPr>
+          <w:i/>
+          <w:iCs/>
+          <w:lang w:val="es-ES"/>
+        </w:rPr>
+        <w:t>wizards</w:t>
+      </w:r>
+      <w:proofErr w:type="spellEnd"/>
+      <w:r>
+        <w:rPr>
+          <w:i/>
+          <w:iCs/>
+          <w:lang w:val="es-ES"/>
+        </w:rPr>
+        <w:t xml:space="preserve"> de anuncios).</w:t>
+      </w:r>
+    </w:p>
+    <w:p>
+      <w:pPr>
+        <w:numPr>
+          <w:ilvl w:val="0"/>
+          <w:numId w:val="10"/>
+        </w:numPr>
+        <w:rPr>
+          <w:lang w:val="es-ES"/>
+        </w:rPr>
+      </w:pPr>
+      <w:proofErr w:type="spellStart"/>
+      <w:r>
+        <w:rPr>
+          <w:b/>
+          <w:bCs/>
+          <w:lang w:val="es-ES"/>
+        </w:rPr>
+        <w:t>resources</w:t>
+      </w:r>
+      <w:proofErr w:type="spellEnd"/>
+      <w:r>
+        <w:rPr>
+          <w:b/>
+          <w:bCs/>
+          <w:lang w:val="es-ES"/>
+        </w:rPr>
+        <w:t> (Recursos y PDF):</w:t>
+      </w:r>
+      <w:r>
+        <w:rPr>
+          <w:lang w:val="es-ES"/>
+        </w:rPr>
+        <w:t> Guarda el nombre, la categoría ("Solicitudes", "Aplicaciones", etc.), la ruta del archivo, tipo y fecha de subida de los documentos.</w:t>
+      </w:r>
+    </w:p>
+    <w:p>
+      <w:pPr>
+        <w:numPr>
+          <w:ilvl w:val="0"/>
+          <w:numId w:val="10"/>
+        </w:numPr>
+        <w:rPr>
+          <w:lang w:val="es-ES"/>
+        </w:rPr>
+      </w:pPr>
+      <w:proofErr w:type="spellStart"/>
+      <w:r>
+        <w:rPr>
+          <w:b/>
+          <w:bCs/>
+          <w:lang w:val="es-ES"/>
+        </w:rPr>
+        <w:t>employees</w:t>
+      </w:r>
+      <w:proofErr w:type="spellEnd"/>
+      <w:r>
+        <w:rPr>
+          <w:b/>
+          <w:bCs/>
+          <w:lang w:val="es-ES"/>
+        </w:rPr>
+        <w:t> (Empleados/Directorio):</w:t>
+      </w:r>
+      <w:r>
+        <w:rPr>
+          <w:lang w:val="es-ES"/>
+        </w:rPr>
+        <w:t> Guarda el nombre del trabajador, su posición, departamento, URL de la foto y fecha de cumpleaños (ej. "18 de Julio").</w:t>
+      </w:r>
+    </w:p>
+    <w:p>
+      <w:pPr>
+        <w:numPr>
+          <w:ilvl w:val="0"/>
+          <w:numId w:val="10"/>
+        </w:numPr>
+        <w:rPr>
+          <w:lang w:val="es-ES"/>
+        </w:rPr>
+      </w:pPr>
+      <w:proofErr w:type="spellStart"/>
+      <w:r>
+        <w:rPr>
+          <w:b/>
+          <w:bCs/>
+          <w:lang w:val="es-ES"/>
+        </w:rPr>
+        <w:t>kpi_metrics</w:t>
+      </w:r>
+      <w:proofErr w:type="spellEnd"/>
+      <w:r>
+        <w:rPr>
+          <w:b/>
+          <w:bCs/>
+          <w:lang w:val="es-ES"/>
+        </w:rPr>
+        <w:t> (Métricas Trimestrales):</w:t>
+      </w:r>
+      <w:r>
+        <w:rPr>
+          <w:lang w:val="es-ES"/>
+        </w:rPr>
+        <w:t> Guarda el título de la métrica (ej. Clientes Activos), el valor (ej. 23%), la tendencia (hacia arriba, abajo o neutral) y la fecha de actualización.</w:t>
+      </w:r>
+    </w:p>
+    <w:p>
+      <w:pPr>
+        <w:numPr>
+          <w:ilvl w:val="0"/>
+          <w:numId w:val="10"/>
+        </w:numPr>
+        <w:rPr>
+          <w:lang w:val="es-ES"/>
+        </w:rPr>
+      </w:pPr>
+      <w:proofErr w:type="spellStart"/>
+      <w:r>
+        <w:rPr>
+          <w:b/>
+          <w:bCs/>
+          <w:lang w:val="es-ES"/>
+        </w:rPr>
+        <w:t>calendar_events</w:t>
+      </w:r>
+      <w:proofErr w:type="spellEnd"/>
+      <w:r>
+        <w:rPr>
+          <w:b/>
+          <w:bCs/>
+          <w:lang w:val="es-ES"/>
+        </w:rPr>
+        <w:t> (Eventos del Calendario):</w:t>
+      </w:r>
+      <w:r>
+        <w:rPr>
+          <w:lang w:val="es-ES"/>
+        </w:rPr>
+        <w:t> Guarda el día, mes, año, título y descripción para eventos marcados.</w:t>
+      </w:r>
+    </w:p>
+    <w:p>
+      <w:pPr>
+        <w:numPr>
+          <w:ilvl w:val="0"/>
+          <w:numId w:val="10"/>
+        </w:numPr>
+        <w:rPr>
+          <w:lang w:val="es-ES"/>
+        </w:rPr>
+      </w:pPr>
+      <w:proofErr w:type="spellStart"/>
+      <w:r>
+        <w:rPr>
+          <w:b/>
+          <w:bCs/>
+          <w:lang w:val="es-ES"/>
+        </w:rPr>
+        <w:t>feedback</w:t>
+      </w:r>
+      <w:proofErr w:type="spellEnd"/>
+      <w:r>
+        <w:rPr>
+          <w:b/>
+          <w:bCs/>
+          <w:lang w:val="es-ES"/>
+        </w:rPr>
+        <w:t> (Sugerencias):</w:t>
+      </w:r>
+      <w:r>
+        <w:rPr>
+          <w:lang w:val="es-ES"/>
+        </w:rPr>
+        <w:t> Almacena comentarios, el email del usuario que lo dejó y la fecha.</w:t>
+      </w:r>
+    </w:p>
+    <w:p>
+      <w:pPr>
+        <w:numPr>
+          <w:ilvl w:val="0"/>
+          <w:numId w:val="10"/>
+        </w:numPr>
+        <w:rPr>
+          <w:lang w:val="es-ES"/>
+        </w:rPr>
+      </w:pPr>
+      <w:proofErr w:type="spellStart"/>
+      <w:r>
+        <w:rPr>
+          <w:b/>
+          <w:bCs/>
+          <w:lang w:val="es-ES"/>
+        </w:rPr>
+        <w:t>chat_messages</w:t>
+      </w:r>
+      <w:proofErr w:type="spellEnd"/>
+      <w:r>
+        <w:rPr>
+          <w:b/>
+          <w:bCs/>
+          <w:lang w:val="es-ES"/>
+        </w:rPr>
+        <w:t> (Mensajes del Chat):</w:t>
+      </w:r>
+      <w:r>
+        <w:rPr>
+          <w:lang w:val="es-ES"/>
+        </w:rPr>
+        <w:t> Guarda el canal, nombre del usuario, correo, contenido del mensaje y cuándo fue enviado.</w:t>
+      </w:r>
     </w:p>
     <w:p>
       <w:pPr>
@@ -826,10 +1201,13 @@
           <w:i/>
           <w:iCs/>
           <w:color w:val="000000" w:themeColor="text1"/>
+          <w:lang w:val="es-ES"/>
         </w:rPr>
       </w:pPr>
       <w:r>
-        <w:lastRenderedPageBreak/>
+        <w:rPr>
+          <w:lang w:val="es-ES"/>
+        </w:rPr>
         <w:br w:type="page"/>
       </w:r>
     </w:p>
@@ -872,9 +1250,36 @@
     </w:p>
     <w:p>
       <w:pPr>
-        <w:pStyle w:val="Cita"/>
+        <w:pStyle w:val="Ttulo2"/>
       </w:pPr>
     </w:p>
+    <w:p>
+      <w:pPr>
+        <w:pStyle w:val="Ttulo2"/>
+      </w:pPr>
+    </w:p>
+    <w:p>
+      <w:pPr>
+        <w:pStyle w:val="Ttulo2"/>
+      </w:pPr>
+      <w:proofErr w:type="spellStart"/>
+      <w:r>
+        <w:t>Ssh</w:t>
+      </w:r>
+      <w:proofErr w:type="spellEnd"/>
+      <w:r>
+        <w:t xml:space="preserve"> </w:t>
+      </w:r>
+      <w:hyperlink r:id="rId6" w:history="1">
+        <w:r>
+          <w:rPr>
+            <w:rStyle w:val="Hipervnculo"/>
+          </w:rPr>
+          <w:t>root@10.0.1.172</w:t>
+        </w:r>
+      </w:hyperlink>
+    </w:p>
+    <w:p/>
     <w:sectPr>
       <w:pgSz w:w="12240" w:h="15840"/>
       <w:pgMar w:top="1440" w:right="1800" w:bottom="1440" w:left="1800" w:header="720" w:footer="720" w:gutter="0"/>
@@ -1056,6 +1461,119 @@
       <w:rPr>
         <w:rFonts w:ascii="Symbol" w:hAnsi="Symbol" w:hint="default"/>
       </w:rPr>
+    </w:lvl>
+  </w:abstractNum>
+  <w:abstractNum w:abstractNumId="9" w15:restartNumberingAfterBreak="0">
+    <w:nsid w:val="4FA71083"/>
+    <w:multiLevelType w:val="multilevel"/>
+    <w:tmpl w:val="441A231C"/>
+    <w:lvl w:ilvl="0">
+      <w:start w:val="1"/>
+      <w:numFmt w:val="decimal"/>
+      <w:lvlText w:val="%1."/>
+      <w:lvlJc w:val="left"/>
+      <w:pPr>
+        <w:tabs>
+          <w:tab w:val="num" w:pos="720"/>
+        </w:tabs>
+        <w:ind w:left="720" w:hanging="360"/>
+      </w:pPr>
+    </w:lvl>
+    <w:lvl w:ilvl="1" w:tentative="1">
+      <w:start w:val="1"/>
+      <w:numFmt w:val="decimal"/>
+      <w:lvlText w:val="%2."/>
+      <w:lvlJc w:val="left"/>
+      <w:pPr>
+        <w:tabs>
+          <w:tab w:val="num" w:pos="1440"/>
+        </w:tabs>
+        <w:ind w:left="1440" w:hanging="360"/>
+      </w:pPr>
+    </w:lvl>
+    <w:lvl w:ilvl="2" w:tentative="1">
+      <w:start w:val="1"/>
+      <w:numFmt w:val="decimal"/>
+      <w:lvlText w:val="%3."/>
+      <w:lvlJc w:val="left"/>
+      <w:pPr>
+        <w:tabs>
+          <w:tab w:val="num" w:pos="2160"/>
+        </w:tabs>
+        <w:ind w:left="2160" w:hanging="360"/>
+      </w:pPr>
+    </w:lvl>
+    <w:lvl w:ilvl="3" w:tentative="1">
+      <w:start w:val="1"/>
+      <w:numFmt w:val="decimal"/>
+      <w:lvlText w:val="%4."/>
+      <w:lvlJc w:val="left"/>
+      <w:pPr>
+        <w:tabs>
+          <w:tab w:val="num" w:pos="2880"/>
+        </w:tabs>
+        <w:ind w:left="2880" w:hanging="360"/>
+      </w:pPr>
+    </w:lvl>
+    <w:lvl w:ilvl="4" w:tentative="1">
+      <w:start w:val="1"/>
+      <w:numFmt w:val="decimal"/>
+      <w:lvlText w:val="%5."/>
+      <w:lvlJc w:val="left"/>
+      <w:pPr>
+        <w:tabs>
+          <w:tab w:val="num" w:pos="3600"/>
+        </w:tabs>
+        <w:ind w:left="3600" w:hanging="360"/>
+      </w:pPr>
+    </w:lvl>
+    <w:lvl w:ilvl="5" w:tentative="1">
+      <w:start w:val="1"/>
+      <w:numFmt w:val="decimal"/>
+      <w:lvlText w:val="%6."/>
+      <w:lvlJc w:val="left"/>
+      <w:pPr>
+        <w:tabs>
+          <w:tab w:val="num" w:pos="4320"/>
+        </w:tabs>
+        <w:ind w:left="4320" w:hanging="360"/>
+      </w:pPr>
+    </w:lvl>
+    <w:lvl w:ilvl="6" w:tentative="1">
+      <w:start w:val="1"/>
+      <w:numFmt w:val="decimal"/>
+      <w:lvlText w:val="%7."/>
+      <w:lvlJc w:val="left"/>
+      <w:pPr>
+        <w:tabs>
+          <w:tab w:val="num" w:pos="5040"/>
+        </w:tabs>
+        <w:ind w:left="5040" w:hanging="360"/>
+      </w:pPr>
+    </w:lvl>
+    <w:lvl w:ilvl="7" w:tentative="1">
+      <w:start w:val="1"/>
+      <w:numFmt w:val="decimal"/>
+      <w:lvlText w:val="%8."/>
+      <w:lvlJc w:val="left"/>
+      <w:pPr>
+        <w:tabs>
+          <w:tab w:val="num" w:pos="5760"/>
+        </w:tabs>
+        <w:ind w:left="5760" w:hanging="360"/>
+      </w:pPr>
+    </w:lvl>
+    <w:lvl w:ilvl="8" w:tentative="1">
+      <w:start w:val="1"/>
+      <w:numFmt w:val="decimal"/>
+      <w:lvlText w:val="%9."/>
+      <w:lvlJc w:val="left"/>
+      <w:pPr>
+        <w:tabs>
+          <w:tab w:val="num" w:pos="6480"/>
+        </w:tabs>
+        <w:ind w:left="6480" w:hanging="360"/>
+      </w:pPr>
     </w:lvl>
   </w:abstractNum>
   <w:num w:numId="1">
@@ -1084,6 +1602,9 @@
   </w:num>
   <w:num w:numId="9">
     <w:abstractNumId w:val="0"/>
+  </w:num>
+  <w:num w:numId="10">
+    <w:abstractNumId w:val="9"/>
   </w:num>
 </w:numbering>
 </file>
@@ -1373,10 +1894,6 @@
     <w:lsdException w:name="Book Title" w:uiPriority="33" w:qFormat="1"/>
     <w:lsdException w:name="Bibliography" w:semiHidden="1" w:uiPriority="37" w:unhideWhenUsed="1"/>
     <w:lsdException w:name="TOC Heading" w:semiHidden="1" w:uiPriority="39" w:unhideWhenUsed="1" w:qFormat="1"/>
-    <w:lsdException w:name="Grid Table Light" w:semiHidden="1" w:unhideWhenUsed="1"/>
-    <w:lsdException w:name="Grid Table 1 Light" w:semiHidden="1" w:unhideWhenUsed="1"/>
-    <w:lsdException w:name="Grid Table 2" w:semiHidden="1" w:unhideWhenUsed="1"/>
-    <w:lsdException w:name="Grid Table 3" w:semiHidden="1" w:unhideWhenUsed="1"/>
     <w:lsdException w:name="Grid Table 4" w:uiPriority="49"/>
     <w:lsdException w:name="Grid Table 5 Dark" w:uiPriority="50"/>
     <w:lsdException w:name="Grid Table 6 Colorful" w:uiPriority="51"/>
@@ -1694,7 +2211,6 @@
   <w:style w:type="character" w:default="1" w:styleId="Fuentedeprrafopredeter">
     <w:name w:val="Default Paragraph Font"/>
     <w:uiPriority w:val="1"/>
-    <w:semiHidden/>
     <w:unhideWhenUsed/>
   </w:style>
   <w:style w:type="table" w:default="1" w:styleId="Tablanormal">
@@ -12470,6 +12986,29 @@
         <w:shd w:val="clear" w:color="auto" w:fill="FBCAA2" w:themeFill="accent6" w:themeFillTint="7F"/>
       </w:tcPr>
     </w:tblStylePr>
+  </w:style>
+  <w:style w:type="character" w:styleId="Hipervnculo">
+    <w:name w:val="Hyperlink"/>
+    <w:basedOn w:val="Fuentedeprrafopredeter"/>
+    <w:uiPriority w:val="99"/>
+    <w:unhideWhenUsed/>
+    <w:rsid w:val="00CC3C09"/>
+    <w:rPr>
+      <w:color w:val="0000FF" w:themeColor="hyperlink"/>
+      <w:u w:val="single"/>
+    </w:rPr>
+  </w:style>
+  <w:style w:type="character" w:styleId="Mencinsinresolver">
+    <w:name w:val="Unresolved Mention"/>
+    <w:basedOn w:val="Fuentedeprrafopredeter"/>
+    <w:uiPriority w:val="99"/>
+    <w:semiHidden/>
+    <w:unhideWhenUsed/>
+    <w:rsid w:val="00CC3C09"/>
+    <w:rPr>
+      <w:color w:val="605E5C"/>
+      <w:shd w:val="clear" w:color="auto" w:fill="E1DFDD"/>
+    </w:rPr>
   </w:style>
 </w:styles>
 </file>
@@ -12799,7 +13338,7 @@
 </file>
 
 <file path=customXml/itemProps1.xml><?xml version="1.0" encoding="utf-8"?>
-<ds:datastoreItem xmlns:ds="http://schemas.openxmlformats.org/officeDocument/2006/customXml" ds:itemID="{29846C79-9404-49EB-AAEF-15E902B93D67}">
+<ds:datastoreItem xmlns:ds="http://schemas.openxmlformats.org/officeDocument/2006/customXml" ds:itemID="{A01A8918-5586-42D0-A0C0-C3B774FBCAAE}">
   <ds:schemaRefs>
     <ds:schemaRef ds:uri="http://schemas.openxmlformats.org/officeDocument/2006/bibliography"/>
   </ds:schemaRefs>

</xml_diff>